<commit_message>
Escribe Actividad 5.3 completa y mejora la teoria de economia de la nube
</commit_message>
<xml_diff>
--- a/docs/tema5/plantillas/Actividad_5_3_INU_Plantilla.docx
+++ b/docs/tema5/plantillas/Actividad_5_3_INU_Plantilla.docx
@@ -139,7 +139,7 @@
                 <w:sz w:val="20"/>
                 <w:szCs w:val="20"/>
               </w:rPr>
-              <w:t xml:space="preserve">Nombre y apellidos: _______________________________________________________</w:t>
+              <w:t xml:space="preserve">Nombre y apellidos: _____________________________________________________</w:t>
             </w:r>
           </w:p>
           <w:p>
@@ -154,6 +154,20 @@
                 <w:szCs w:val="20"/>
               </w:rPr>
               <w:t xml:space="preserve">Fecha: ____________________________________________________________________</w:t>
+            </w:r>
+          </w:p>
+          <w:p>
+            <w:pPr>
+              <w:spacing w:after="60"/>
+            </w:pPr>
+            <w:r>
+              <w:rPr>
+                <w:rFonts w:ascii="Arial" w:cs="Arial" w:eastAsia="Arial" w:hAnsi="Arial"/>
+                <w:color w:val="263238"/>
+                <w:sz w:val="20"/>
+                <w:szCs w:val="20"/>
+              </w:rPr>
+              <w:t xml:space="preserve">Identificador de recursos usado (ej. escaparate-asg-&lt;tu-identificador&gt;): _______________________</w:t>
             </w:r>
           </w:p>
         </w:tc>
@@ -184,7 +198,7 @@
           <w:sz w:val="26"/>
           <w:szCs w:val="26"/>
         </w:rPr>
-        <w:t xml:space="preserve">Parte A — Estima la arquitectura de referencia</w:t>
+        <w:t xml:space="preserve">Parte A — Desglosa y calcula el coste real de tu arquitectura</w:t>
       </w:r>
     </w:p>
     <w:p>
@@ -208,7 +222,21 @@
           <w:sz w:val="24"/>
           <w:szCs w:val="24"/>
         </w:rPr>
-        <w:t xml:space="preserve">Paso 1 — Abre la calculadora y añade el cómputo</w:t>
+        <w:t xml:space="preserve">Paso 1 — Lista tus componentes facturables</w:t>
+      </w:r>
+    </w:p>
+    <w:p>
+      <w:pPr>
+        <w:spacing w:after="100"/>
+      </w:pPr>
+      <w:r>
+        <w:rPr>
+          <w:rFonts w:ascii="Arial" w:cs="Arial" w:eastAsia="Arial" w:hAnsi="Arial"/>
+          <w:color w:val="212121"/>
+          <w:sz w:val="22"/>
+          <w:szCs w:val="22"/>
+        </w:rPr>
+        <w:t xml:space="preserve">Tu lista completa: EC2 (tipo y réplicas), balanceador, RDS (motor, clase, GB), S3 (imágenes y frontend, GB aproximados) y tráfico estimado. Marca también lo que ya esté apagado.</w:t>
       </w:r>
     </w:p>
     <w:tbl>
@@ -227,73 +255,193 @@
         <w:gridCol w:w="9638"/>
       </w:tblGrid>
       <w:tr>
-        <w:tc>
-          <w:tcPr>
-            <w:tcW w:type="dxa" w:w="9638"/>
-            <w:tcBorders>
-              <w:top w:val="none" w:color="FFFFFF" w:sz="0"/>
-              <w:left w:val="none" w:color="FFFFFF" w:sz="0"/>
-              <w:bottom w:val="none" w:color="FFFFFF" w:sz="0"/>
-              <w:right w:val="none" w:color="FFFFFF" w:sz="0"/>
-            </w:tcBorders>
-            <w:shd w:fill="3949AB" w:val="clear"/>
-            <w:tcMar>
-              <w:top w:type="dxa" w:w="80"/>
-              <w:left w:type="dxa" w:w="160"/>
-              <w:bottom w:type="dxa" w:w="80"/>
-              <w:right w:type="dxa" w:w="160"/>
-            </w:tcMar>
-          </w:tcPr>
-          <w:p>
-            <w:r>
-              <w:rPr>
-                <w:rFonts w:ascii="Arial" w:cs="Arial" w:eastAsia="Arial" w:hAnsi="Arial"/>
-                <w:b/>
-                <w:bCs/>
-                <w:color w:val="FFFFFF"/>
-                <w:sz w:val="20"/>
-                <w:szCs w:val="20"/>
-              </w:rPr>
-              <w:t xml:space="preserve">📸 Línea de EC2 añadida a la calculadora, con el tipo y cantidad de instancias de la arquitectura de referencia</w:t>
-            </w:r>
-          </w:p>
-        </w:tc>
-      </w:tr>
-      <w:tr>
-        <w:trPr>
-          <w:trHeight w:val="2400"/>
-        </w:trPr>
-        <w:tc>
-          <w:tcPr>
-            <w:tcW w:type="dxa" w:w="9638"/>
-            <w:tcBorders>
-              <w:top w:val="single" w:color="E0E0E0" w:sz="4"/>
-              <w:left w:val="single" w:color="E0E0E0" w:sz="4"/>
-              <w:bottom w:val="single" w:color="E0E0E0" w:sz="4"/>
-              <w:right w:val="single" w:color="E0E0E0" w:sz="4"/>
-            </w:tcBorders>
-            <w:shd w:fill="FAFAFA" w:val="clear"/>
-            <w:tcMar>
-              <w:top w:type="dxa" w:w="80"/>
-              <w:left w:type="dxa" w:w="160"/>
-              <w:bottom w:type="dxa" w:w="80"/>
-              <w:right w:type="dxa" w:w="160"/>
-            </w:tcMar>
-          </w:tcPr>
-          <w:p>
-            <w:pPr>
-              <w:jc w:val="center"/>
-            </w:pPr>
-            <w:r>
-              <w:rPr>
-                <w:rFonts w:ascii="Arial" w:cs="Arial" w:eastAsia="Arial" w:hAnsi="Arial"/>
-                <w:i/>
-                <w:iCs/>
-                <w:color w:val="757575"/>
-                <w:sz w:val="20"/>
-                <w:szCs w:val="20"/>
-              </w:rPr>
-              <w:t xml:space="preserve">[Pega aquí la captura de pantalla]</w:t>
+        <w:trPr>
+          <w:trHeight w:val="480"/>
+        </w:trPr>
+        <w:tc>
+          <w:tcPr>
+            <w:tcW w:type="dxa" w:w="9638"/>
+            <w:tcBorders>
+              <w:top w:val="single" w:color="E0E0E0" w:sz="4"/>
+              <w:left w:val="single" w:color="E0E0E0" w:sz="4"/>
+              <w:bottom w:val="single" w:color="E0E0E0" w:sz="4"/>
+              <w:right w:val="single" w:color="E0E0E0" w:sz="4"/>
+            </w:tcBorders>
+            <w:shd w:fill="FAFAFA" w:val="clear"/>
+            <w:tcMar>
+              <w:top w:type="dxa" w:w="60"/>
+              <w:left w:type="dxa" w:w="160"/>
+              <w:bottom w:type="dxa" w:w="60"/>
+              <w:right w:type="dxa" w:w="160"/>
+            </w:tcMar>
+          </w:tcPr>
+          <w:p>
+            <w:r>
+              <w:rPr>
+                <w:sz w:val="22"/>
+                <w:szCs w:val="22"/>
+              </w:rPr>
+              <w:t xml:space="preserve"/>
+            </w:r>
+          </w:p>
+        </w:tc>
+      </w:tr>
+      <w:tr>
+        <w:trPr>
+          <w:trHeight w:val="480"/>
+        </w:trPr>
+        <w:tc>
+          <w:tcPr>
+            <w:tcW w:type="dxa" w:w="9638"/>
+            <w:tcBorders>
+              <w:top w:val="single" w:color="E0E0E0" w:sz="4"/>
+              <w:left w:val="single" w:color="E0E0E0" w:sz="4"/>
+              <w:bottom w:val="single" w:color="E0E0E0" w:sz="4"/>
+              <w:right w:val="single" w:color="E0E0E0" w:sz="4"/>
+            </w:tcBorders>
+            <w:shd w:fill="FAFAFA" w:val="clear"/>
+            <w:tcMar>
+              <w:top w:type="dxa" w:w="60"/>
+              <w:left w:type="dxa" w:w="160"/>
+              <w:bottom w:type="dxa" w:w="60"/>
+              <w:right w:type="dxa" w:w="160"/>
+            </w:tcMar>
+          </w:tcPr>
+          <w:p>
+            <w:r>
+              <w:rPr>
+                <w:sz w:val="22"/>
+                <w:szCs w:val="22"/>
+              </w:rPr>
+              <w:t xml:space="preserve"/>
+            </w:r>
+          </w:p>
+        </w:tc>
+      </w:tr>
+      <w:tr>
+        <w:trPr>
+          <w:trHeight w:val="480"/>
+        </w:trPr>
+        <w:tc>
+          <w:tcPr>
+            <w:tcW w:type="dxa" w:w="9638"/>
+            <w:tcBorders>
+              <w:top w:val="single" w:color="E0E0E0" w:sz="4"/>
+              <w:left w:val="single" w:color="E0E0E0" w:sz="4"/>
+              <w:bottom w:val="single" w:color="E0E0E0" w:sz="4"/>
+              <w:right w:val="single" w:color="E0E0E0" w:sz="4"/>
+            </w:tcBorders>
+            <w:shd w:fill="FAFAFA" w:val="clear"/>
+            <w:tcMar>
+              <w:top w:type="dxa" w:w="60"/>
+              <w:left w:type="dxa" w:w="160"/>
+              <w:bottom w:type="dxa" w:w="60"/>
+              <w:right w:type="dxa" w:w="160"/>
+            </w:tcMar>
+          </w:tcPr>
+          <w:p>
+            <w:r>
+              <w:rPr>
+                <w:sz w:val="22"/>
+                <w:szCs w:val="22"/>
+              </w:rPr>
+              <w:t xml:space="preserve"/>
+            </w:r>
+          </w:p>
+        </w:tc>
+      </w:tr>
+      <w:tr>
+        <w:trPr>
+          <w:trHeight w:val="480"/>
+        </w:trPr>
+        <w:tc>
+          <w:tcPr>
+            <w:tcW w:type="dxa" w:w="9638"/>
+            <w:tcBorders>
+              <w:top w:val="single" w:color="E0E0E0" w:sz="4"/>
+              <w:left w:val="single" w:color="E0E0E0" w:sz="4"/>
+              <w:bottom w:val="single" w:color="E0E0E0" w:sz="4"/>
+              <w:right w:val="single" w:color="E0E0E0" w:sz="4"/>
+            </w:tcBorders>
+            <w:shd w:fill="FAFAFA" w:val="clear"/>
+            <w:tcMar>
+              <w:top w:type="dxa" w:w="60"/>
+              <w:left w:type="dxa" w:w="160"/>
+              <w:bottom w:type="dxa" w:w="60"/>
+              <w:right w:type="dxa" w:w="160"/>
+            </w:tcMar>
+          </w:tcPr>
+          <w:p>
+            <w:r>
+              <w:rPr>
+                <w:sz w:val="22"/>
+                <w:szCs w:val="22"/>
+              </w:rPr>
+              <w:t xml:space="preserve"/>
+            </w:r>
+          </w:p>
+        </w:tc>
+      </w:tr>
+      <w:tr>
+        <w:trPr>
+          <w:trHeight w:val="480"/>
+        </w:trPr>
+        <w:tc>
+          <w:tcPr>
+            <w:tcW w:type="dxa" w:w="9638"/>
+            <w:tcBorders>
+              <w:top w:val="single" w:color="E0E0E0" w:sz="4"/>
+              <w:left w:val="single" w:color="E0E0E0" w:sz="4"/>
+              <w:bottom w:val="single" w:color="E0E0E0" w:sz="4"/>
+              <w:right w:val="single" w:color="E0E0E0" w:sz="4"/>
+            </w:tcBorders>
+            <w:shd w:fill="FAFAFA" w:val="clear"/>
+            <w:tcMar>
+              <w:top w:type="dxa" w:w="60"/>
+              <w:left w:type="dxa" w:w="160"/>
+              <w:bottom w:type="dxa" w:w="60"/>
+              <w:right w:type="dxa" w:w="160"/>
+            </w:tcMar>
+          </w:tcPr>
+          <w:p>
+            <w:r>
+              <w:rPr>
+                <w:sz w:val="22"/>
+                <w:szCs w:val="22"/>
+              </w:rPr>
+              <w:t xml:space="preserve"/>
+            </w:r>
+          </w:p>
+        </w:tc>
+      </w:tr>
+      <w:tr>
+        <w:trPr>
+          <w:trHeight w:val="480"/>
+        </w:trPr>
+        <w:tc>
+          <w:tcPr>
+            <w:tcW w:type="dxa" w:w="9638"/>
+            <w:tcBorders>
+              <w:top w:val="single" w:color="E0E0E0" w:sz="4"/>
+              <w:left w:val="single" w:color="E0E0E0" w:sz="4"/>
+              <w:bottom w:val="single" w:color="E0E0E0" w:sz="4"/>
+              <w:right w:val="single" w:color="E0E0E0" w:sz="4"/>
+            </w:tcBorders>
+            <w:shd w:fill="FAFAFA" w:val="clear"/>
+            <w:tcMar>
+              <w:top w:type="dxa" w:w="60"/>
+              <w:left w:type="dxa" w:w="160"/>
+              <w:bottom w:type="dxa" w:w="60"/>
+              <w:right w:type="dxa" w:w="160"/>
+            </w:tcMar>
+          </w:tcPr>
+          <w:p>
+            <w:r>
+              <w:rPr>
+                <w:sz w:val="22"/>
+                <w:szCs w:val="22"/>
+              </w:rPr>
+              <w:t xml:space="preserve"/>
             </w:r>
           </w:p>
         </w:tc>
@@ -301,8 +449,13 @@
     </w:tbl>
     <w:p>
       <w:pPr>
-        <w:spacing w:after="200"/>
-      </w:pPr>
+        <w:spacing w:after="160"/>
+      </w:pPr>
+    </w:p>
+    <w:p>
+      <w:r>
+        <w:br w:type="page"/>
+      </w:r>
     </w:p>
     <w:p>
       <w:pPr>
@@ -320,7 +473,7 @@
           <w:sz w:val="24"/>
           <w:szCs w:val="24"/>
         </w:rPr>
-        <w:t xml:space="preserve">Paso 2 — Añade el resto de servicios de la arquitectura de referencia</w:t>
+        <w:t xml:space="preserve">Paso 2 — Estima cada componente con la calculadora oficial</w:t>
       </w:r>
     </w:p>
     <w:tbl>
@@ -366,7 +519,7 @@
                 <w:sz w:val="20"/>
                 <w:szCs w:val="20"/>
               </w:rPr>
-              <w:t xml:space="preserve">📸 Estimación completa con todos los servicios de la arquitectura de referencia añadidos, desglose y total mensual</w:t>
+              <w:t xml:space="preserve">📸 Cada línea de la calculadora con su coste individual, y el resumen final con el total mensual y anual</w:t>
             </w:r>
           </w:p>
         </w:tc>
@@ -413,7 +566,7 @@
     </w:tbl>
     <w:p>
       <w:pPr>
-        <w:spacing w:after="160"/>
+        <w:spacing w:after="200"/>
       </w:pPr>
     </w:p>
     <w:p>
@@ -432,7 +585,7 @@
           <w:sz w:val="24"/>
           <w:szCs w:val="24"/>
         </w:rPr>
-        <w:t xml:space="preserve">Reflexiona</w:t>
+        <w:t xml:space="preserve">Paso 3 — Compara tu estimación con el crédito real del Lab</w:t>
       </w:r>
     </w:p>
     <w:p>
@@ -446,7 +599,7 @@
           <w:sz w:val="22"/>
           <w:szCs w:val="22"/>
         </w:rPr>
-        <w:t xml:space="preserve">De todas las líneas de tu desglose, ¿cuál te ha sorprendido más —por ser más cara o más barata de lo que esperabas antes de calcularlo?</w:t>
+        <w:t xml:space="preserve">¿Cuántos meses aguantaría esta arquitectura, en una cuenta personal de verdad, con el crédito que te queda ahora mismo? ¿Te sorprende el resultado, por arriba o por abajo?</w:t>
       </w:r>
     </w:p>
     <w:tbl>
@@ -560,488 +713,10 @@
           </w:p>
         </w:tc>
       </w:tr>
-      <w:tr>
-        <w:trPr>
-          <w:trHeight w:val="480"/>
-        </w:trPr>
-        <w:tc>
-          <w:tcPr>
-            <w:tcW w:type="dxa" w:w="9638"/>
-            <w:tcBorders>
-              <w:top w:val="single" w:color="E0E0E0" w:sz="4"/>
-              <w:left w:val="single" w:color="E0E0E0" w:sz="4"/>
-              <w:bottom w:val="single" w:color="E0E0E0" w:sz="4"/>
-              <w:right w:val="single" w:color="E0E0E0" w:sz="4"/>
-            </w:tcBorders>
-            <w:shd w:fill="FAFAFA" w:val="clear"/>
-            <w:tcMar>
-              <w:top w:type="dxa" w:w="60"/>
-              <w:left w:type="dxa" w:w="160"/>
-              <w:bottom w:type="dxa" w:w="60"/>
-              <w:right w:type="dxa" w:w="160"/>
-            </w:tcMar>
-          </w:tcPr>
-          <w:p>
-            <w:r>
-              <w:rPr>
-                <w:sz w:val="22"/>
-                <w:szCs w:val="22"/>
-              </w:rPr>
-              <w:t xml:space="preserve"/>
-            </w:r>
-          </w:p>
-        </w:tc>
-      </w:tr>
     </w:tbl>
     <w:p>
       <w:pPr>
-        <w:spacing w:after="200"/>
-      </w:pPr>
-    </w:p>
-    <w:p>
-      <w:r>
-        <w:br w:type="page"/>
-      </w:r>
-    </w:p>
-    <w:p>
-      <w:pPr>
-        <w:shd w:fill="3949AB" w:val="clear"/>
-        <w:spacing w:after="0" w:before="320"/>
-        <w:ind w:left="200" w:right="200"/>
-      </w:pPr>
-      <w:r>
-        <w:rPr>
-          <w:rFonts w:ascii="Arial" w:cs="Arial" w:eastAsia="Arial" w:hAnsi="Arial"/>
-          <w:b/>
-          <w:bCs/>
-          <w:color w:val="FFFFFF"/>
-          <w:sz w:val="26"/>
-          <w:szCs w:val="26"/>
-        </w:rPr>
-        <w:t xml:space="preserve">Parte B — Reto: reestima, optimiza y decide una migración</w:t>
-      </w:r>
-    </w:p>
-    <w:p>
-      <w:pPr>
         <w:spacing w:after="120"/>
-      </w:pPr>
-    </w:p>
-    <w:p>
-      <w:pPr>
-        <w:pBdr>
-          <w:bottom w:val="single" w:color="FFA000" w:sz="4" w:space="1"/>
-        </w:pBdr>
-        <w:spacing w:after="120" w:before="240"/>
-      </w:pPr>
-      <w:r>
-        <w:rPr>
-          <w:rFonts w:ascii="Arial" w:cs="Arial" w:eastAsia="Arial" w:hAnsi="Arial"/>
-          <w:b/>
-          <w:bCs/>
-          <w:color w:val="3949AB"/>
-          <w:sz w:val="24"/>
-          <w:szCs w:val="24"/>
-        </w:rPr>
-        <w:t xml:space="preserve">Reestima tres escenarios</w:t>
-      </w:r>
-    </w:p>
-    <w:p>
-      <w:pPr>
-        <w:spacing w:after="100"/>
-      </w:pPr>
-      <w:r>
-        <w:rPr>
-          <w:rFonts w:ascii="Arial" w:cs="Arial" w:eastAsia="Arial" w:hAnsi="Arial"/>
-          <w:color w:val="212121"/>
-          <w:sz w:val="22"/>
-          <w:szCs w:val="22"/>
-        </w:rPr>
-        <w:t xml:space="preserve">Modelo de compra elegido y justificación para cada uno de los tres escenarios (tráfico x10 sostenido, pico de campaña de dos semanas, apagado nocturno y de fin de semana).</w:t>
-      </w:r>
-    </w:p>
-    <w:tbl>
-      <w:tblPr>
-        <w:tblW w:type="dxa" w:w="9638"/>
-        <w:tblBorders>
-          <w:top w:val="single" w:color="auto" w:sz="4"/>
-          <w:left w:val="single" w:color="auto" w:sz="4"/>
-          <w:bottom w:val="single" w:color="auto" w:sz="4"/>
-          <w:right w:val="single" w:color="auto" w:sz="4"/>
-          <w:insideH w:val="single" w:color="auto" w:sz="4"/>
-          <w:insideV w:val="single" w:color="auto" w:sz="4"/>
-        </w:tblBorders>
-      </w:tblPr>
-      <w:tblGrid>
-        <w:gridCol w:w="2699"/>
-        <w:gridCol w:w="2313"/>
-        <w:gridCol w:w="4626"/>
-      </w:tblGrid>
-      <w:tr>
-        <w:tc>
-          <w:tcPr>
-            <w:tcW w:type="dxa" w:w="2699"/>
-            <w:tcBorders>
-              <w:top w:val="single" w:color="E0E0E0" w:sz="4"/>
-              <w:left w:val="single" w:color="E0E0E0" w:sz="4"/>
-              <w:bottom w:val="single" w:color="E0E0E0" w:sz="4"/>
-              <w:right w:val="single" w:color="E0E0E0" w:sz="4"/>
-            </w:tcBorders>
-            <w:shd w:fill="3949AB" w:val="clear"/>
-            <w:tcMar>
-              <w:top w:type="dxa" w:w="100"/>
-              <w:left w:type="dxa" w:w="140"/>
-              <w:bottom w:type="dxa" w:w="100"/>
-              <w:right w:type="dxa" w:w="100"/>
-            </w:tcMar>
-          </w:tcPr>
-          <w:p>
-            <w:pPr>
-              <w:jc w:val="center"/>
-            </w:pPr>
-            <w:r>
-              <w:rPr>
-                <w:rFonts w:ascii="Arial" w:cs="Arial" w:eastAsia="Arial" w:hAnsi="Arial"/>
-                <w:b/>
-                <w:bCs/>
-                <w:color w:val="FFFFFF"/>
-                <w:sz w:val="20"/>
-                <w:szCs w:val="20"/>
-              </w:rPr>
-              <w:t xml:space="preserve">Escenario</w:t>
-            </w:r>
-          </w:p>
-        </w:tc>
-        <w:tc>
-          <w:tcPr>
-            <w:tcW w:type="dxa" w:w="2313"/>
-            <w:tcBorders>
-              <w:top w:val="single" w:color="E0E0E0" w:sz="4"/>
-              <w:left w:val="single" w:color="E0E0E0" w:sz="4"/>
-              <w:bottom w:val="single" w:color="E0E0E0" w:sz="4"/>
-              <w:right w:val="single" w:color="E0E0E0" w:sz="4"/>
-            </w:tcBorders>
-            <w:shd w:fill="3949AB" w:val="clear"/>
-            <w:tcMar>
-              <w:top w:type="dxa" w:w="100"/>
-              <w:left w:type="dxa" w:w="140"/>
-              <w:bottom w:type="dxa" w:w="100"/>
-              <w:right w:type="dxa" w:w="100"/>
-            </w:tcMar>
-          </w:tcPr>
-          <w:p>
-            <w:pPr>
-              <w:jc w:val="center"/>
-            </w:pPr>
-            <w:r>
-              <w:rPr>
-                <w:rFonts w:ascii="Arial" w:cs="Arial" w:eastAsia="Arial" w:hAnsi="Arial"/>
-                <w:b/>
-                <w:bCs/>
-                <w:color w:val="FFFFFF"/>
-                <w:sz w:val="20"/>
-                <w:szCs w:val="20"/>
-              </w:rPr>
-              <w:t xml:space="preserve">Modelo de compra elegido</w:t>
-            </w:r>
-          </w:p>
-        </w:tc>
-        <w:tc>
-          <w:tcPr>
-            <w:tcW w:type="dxa" w:w="4626"/>
-            <w:tcBorders>
-              <w:top w:val="single" w:color="E0E0E0" w:sz="4"/>
-              <w:left w:val="single" w:color="E0E0E0" w:sz="4"/>
-              <w:bottom w:val="single" w:color="E0E0E0" w:sz="4"/>
-              <w:right w:val="single" w:color="E0E0E0" w:sz="4"/>
-            </w:tcBorders>
-            <w:shd w:fill="3949AB" w:val="clear"/>
-            <w:tcMar>
-              <w:top w:type="dxa" w:w="100"/>
-              <w:left w:type="dxa" w:w="140"/>
-              <w:bottom w:type="dxa" w:w="100"/>
-              <w:right w:type="dxa" w:w="100"/>
-            </w:tcMar>
-          </w:tcPr>
-          <w:p>
-            <w:pPr>
-              <w:jc w:val="center"/>
-            </w:pPr>
-            <w:r>
-              <w:rPr>
-                <w:rFonts w:ascii="Arial" w:cs="Arial" w:eastAsia="Arial" w:hAnsi="Arial"/>
-                <w:b/>
-                <w:bCs/>
-                <w:color w:val="FFFFFF"/>
-                <w:sz w:val="20"/>
-                <w:szCs w:val="20"/>
-              </w:rPr>
-              <w:t xml:space="preserve">Justificación</w:t>
-            </w:r>
-          </w:p>
-        </w:tc>
-      </w:tr>
-      <w:tr>
-        <w:trPr>
-          <w:trHeight w:val="800"/>
-        </w:trPr>
-        <w:tc>
-          <w:tcPr>
-            <w:tcW w:type="dxa" w:w="2699"/>
-            <w:tcBorders>
-              <w:top w:val="single" w:color="E0E0E0" w:sz="4"/>
-              <w:left w:val="single" w:color="E0E0E0" w:sz="4"/>
-              <w:bottom w:val="single" w:color="E0E0E0" w:sz="4"/>
-              <w:right w:val="single" w:color="E0E0E0" w:sz="4"/>
-            </w:tcBorders>
-            <w:shd w:fill="FFFFFF" w:val="clear"/>
-            <w:tcMar>
-              <w:top w:type="dxa" w:w="80"/>
-              <w:left w:type="dxa" w:w="140"/>
-              <w:bottom w:type="dxa" w:w="80"/>
-              <w:right w:type="dxa" w:w="100"/>
-            </w:tcMar>
-          </w:tcPr>
-          <w:p>
-            <w:r>
-              <w:rPr>
-                <w:sz w:val="22"/>
-                <w:szCs w:val="22"/>
-              </w:rPr>
-              <w:t xml:space="preserve"/>
-            </w:r>
-          </w:p>
-        </w:tc>
-        <w:tc>
-          <w:tcPr>
-            <w:tcW w:type="dxa" w:w="2313"/>
-            <w:tcBorders>
-              <w:top w:val="single" w:color="E0E0E0" w:sz="4"/>
-              <w:left w:val="single" w:color="E0E0E0" w:sz="4"/>
-              <w:bottom w:val="single" w:color="E0E0E0" w:sz="4"/>
-              <w:right w:val="single" w:color="E0E0E0" w:sz="4"/>
-            </w:tcBorders>
-            <w:shd w:fill="FFFFFF" w:val="clear"/>
-            <w:tcMar>
-              <w:top w:type="dxa" w:w="80"/>
-              <w:left w:type="dxa" w:w="140"/>
-              <w:bottom w:type="dxa" w:w="80"/>
-              <w:right w:type="dxa" w:w="100"/>
-            </w:tcMar>
-          </w:tcPr>
-          <w:p>
-            <w:r>
-              <w:rPr>
-                <w:sz w:val="22"/>
-                <w:szCs w:val="22"/>
-              </w:rPr>
-              <w:t xml:space="preserve"/>
-            </w:r>
-          </w:p>
-        </w:tc>
-        <w:tc>
-          <w:tcPr>
-            <w:tcW w:type="dxa" w:w="4626"/>
-            <w:tcBorders>
-              <w:top w:val="single" w:color="E0E0E0" w:sz="4"/>
-              <w:left w:val="single" w:color="E0E0E0" w:sz="4"/>
-              <w:bottom w:val="single" w:color="E0E0E0" w:sz="4"/>
-              <w:right w:val="single" w:color="E0E0E0" w:sz="4"/>
-            </w:tcBorders>
-            <w:shd w:fill="FFFFFF" w:val="clear"/>
-            <w:tcMar>
-              <w:top w:type="dxa" w:w="80"/>
-              <w:left w:type="dxa" w:w="140"/>
-              <w:bottom w:type="dxa" w:w="80"/>
-              <w:right w:type="dxa" w:w="100"/>
-            </w:tcMar>
-          </w:tcPr>
-          <w:p>
-            <w:r>
-              <w:rPr>
-                <w:sz w:val="22"/>
-                <w:szCs w:val="22"/>
-              </w:rPr>
-              <w:t xml:space="preserve"/>
-            </w:r>
-          </w:p>
-        </w:tc>
-      </w:tr>
-      <w:tr>
-        <w:trPr>
-          <w:trHeight w:val="800"/>
-        </w:trPr>
-        <w:tc>
-          <w:tcPr>
-            <w:tcW w:type="dxa" w:w="2699"/>
-            <w:tcBorders>
-              <w:top w:val="single" w:color="E0E0E0" w:sz="4"/>
-              <w:left w:val="single" w:color="E0E0E0" w:sz="4"/>
-              <w:bottom w:val="single" w:color="E0E0E0" w:sz="4"/>
-              <w:right w:val="single" w:color="E0E0E0" w:sz="4"/>
-            </w:tcBorders>
-            <w:shd w:fill="F5F5F5" w:val="clear"/>
-            <w:tcMar>
-              <w:top w:type="dxa" w:w="80"/>
-              <w:left w:type="dxa" w:w="140"/>
-              <w:bottom w:type="dxa" w:w="80"/>
-              <w:right w:type="dxa" w:w="100"/>
-            </w:tcMar>
-          </w:tcPr>
-          <w:p>
-            <w:r>
-              <w:rPr>
-                <w:sz w:val="22"/>
-                <w:szCs w:val="22"/>
-              </w:rPr>
-              <w:t xml:space="preserve"/>
-            </w:r>
-          </w:p>
-        </w:tc>
-        <w:tc>
-          <w:tcPr>
-            <w:tcW w:type="dxa" w:w="2313"/>
-            <w:tcBorders>
-              <w:top w:val="single" w:color="E0E0E0" w:sz="4"/>
-              <w:left w:val="single" w:color="E0E0E0" w:sz="4"/>
-              <w:bottom w:val="single" w:color="E0E0E0" w:sz="4"/>
-              <w:right w:val="single" w:color="E0E0E0" w:sz="4"/>
-            </w:tcBorders>
-            <w:shd w:fill="F5F5F5" w:val="clear"/>
-            <w:tcMar>
-              <w:top w:type="dxa" w:w="80"/>
-              <w:left w:type="dxa" w:w="140"/>
-              <w:bottom w:type="dxa" w:w="80"/>
-              <w:right w:type="dxa" w:w="100"/>
-            </w:tcMar>
-          </w:tcPr>
-          <w:p>
-            <w:r>
-              <w:rPr>
-                <w:sz w:val="22"/>
-                <w:szCs w:val="22"/>
-              </w:rPr>
-              <w:t xml:space="preserve"/>
-            </w:r>
-          </w:p>
-        </w:tc>
-        <w:tc>
-          <w:tcPr>
-            <w:tcW w:type="dxa" w:w="4626"/>
-            <w:tcBorders>
-              <w:top w:val="single" w:color="E0E0E0" w:sz="4"/>
-              <w:left w:val="single" w:color="E0E0E0" w:sz="4"/>
-              <w:bottom w:val="single" w:color="E0E0E0" w:sz="4"/>
-              <w:right w:val="single" w:color="E0E0E0" w:sz="4"/>
-            </w:tcBorders>
-            <w:shd w:fill="F5F5F5" w:val="clear"/>
-            <w:tcMar>
-              <w:top w:type="dxa" w:w="80"/>
-              <w:left w:type="dxa" w:w="140"/>
-              <w:bottom w:type="dxa" w:w="80"/>
-              <w:right w:type="dxa" w:w="100"/>
-            </w:tcMar>
-          </w:tcPr>
-          <w:p>
-            <w:r>
-              <w:rPr>
-                <w:sz w:val="22"/>
-                <w:szCs w:val="22"/>
-              </w:rPr>
-              <w:t xml:space="preserve"/>
-            </w:r>
-          </w:p>
-        </w:tc>
-      </w:tr>
-      <w:tr>
-        <w:trPr>
-          <w:trHeight w:val="800"/>
-        </w:trPr>
-        <w:tc>
-          <w:tcPr>
-            <w:tcW w:type="dxa" w:w="2699"/>
-            <w:tcBorders>
-              <w:top w:val="single" w:color="E0E0E0" w:sz="4"/>
-              <w:left w:val="single" w:color="E0E0E0" w:sz="4"/>
-              <w:bottom w:val="single" w:color="E0E0E0" w:sz="4"/>
-              <w:right w:val="single" w:color="E0E0E0" w:sz="4"/>
-            </w:tcBorders>
-            <w:shd w:fill="FFFFFF" w:val="clear"/>
-            <w:tcMar>
-              <w:top w:type="dxa" w:w="80"/>
-              <w:left w:type="dxa" w:w="140"/>
-              <w:bottom w:type="dxa" w:w="80"/>
-              <w:right w:type="dxa" w:w="100"/>
-            </w:tcMar>
-          </w:tcPr>
-          <w:p>
-            <w:r>
-              <w:rPr>
-                <w:sz w:val="22"/>
-                <w:szCs w:val="22"/>
-              </w:rPr>
-              <w:t xml:space="preserve"/>
-            </w:r>
-          </w:p>
-        </w:tc>
-        <w:tc>
-          <w:tcPr>
-            <w:tcW w:type="dxa" w:w="2313"/>
-            <w:tcBorders>
-              <w:top w:val="single" w:color="E0E0E0" w:sz="4"/>
-              <w:left w:val="single" w:color="E0E0E0" w:sz="4"/>
-              <w:bottom w:val="single" w:color="E0E0E0" w:sz="4"/>
-              <w:right w:val="single" w:color="E0E0E0" w:sz="4"/>
-            </w:tcBorders>
-            <w:shd w:fill="FFFFFF" w:val="clear"/>
-            <w:tcMar>
-              <w:top w:type="dxa" w:w="80"/>
-              <w:left w:type="dxa" w:w="140"/>
-              <w:bottom w:type="dxa" w:w="80"/>
-              <w:right w:type="dxa" w:w="100"/>
-            </w:tcMar>
-          </w:tcPr>
-          <w:p>
-            <w:r>
-              <w:rPr>
-                <w:sz w:val="22"/>
-                <w:szCs w:val="22"/>
-              </w:rPr>
-              <w:t xml:space="preserve"/>
-            </w:r>
-          </w:p>
-        </w:tc>
-        <w:tc>
-          <w:tcPr>
-            <w:tcW w:type="dxa" w:w="4626"/>
-            <w:tcBorders>
-              <w:top w:val="single" w:color="E0E0E0" w:sz="4"/>
-              <w:left w:val="single" w:color="E0E0E0" w:sz="4"/>
-              <w:bottom w:val="single" w:color="E0E0E0" w:sz="4"/>
-              <w:right w:val="single" w:color="E0E0E0" w:sz="4"/>
-            </w:tcBorders>
-            <w:shd w:fill="FFFFFF" w:val="clear"/>
-            <w:tcMar>
-              <w:top w:type="dxa" w:w="80"/>
-              <w:left w:type="dxa" w:w="140"/>
-              <w:bottom w:type="dxa" w:w="80"/>
-              <w:right w:type="dxa" w:w="100"/>
-            </w:tcMar>
-          </w:tcPr>
-          <w:p>
-            <w:r>
-              <w:rPr>
-                <w:sz w:val="22"/>
-                <w:szCs w:val="22"/>
-              </w:rPr>
-              <w:t xml:space="preserve"/>
-            </w:r>
-          </w:p>
-        </w:tc>
-      </w:tr>
-    </w:tbl>
-    <w:p>
-      <w:pPr>
-        <w:spacing w:after="160"/>
       </w:pPr>
     </w:p>
     <w:tbl>
@@ -1087,7 +762,7 @@
                 <w:sz w:val="20"/>
                 <w:szCs w:val="20"/>
               </w:rPr>
-              <w:t xml:space="preserve">📸 Las tres estimaciones de escenarios en la calculadora, desglosadas por servicio</w:t>
+              <w:t xml:space="preserve">📸 El crédito restante en el panel AWS Details, junto a tu cálculo de meses</w:t>
             </w:r>
           </w:p>
         </w:tc>
@@ -1134,13 +809,36 @@
     </w:tbl>
     <w:p>
       <w:pPr>
-        <w:spacing w:after="200"/>
+        <w:spacing w:after="160"/>
       </w:pPr>
     </w:p>
     <w:p>
       <w:r>
         <w:br w:type="page"/>
       </w:r>
+    </w:p>
+    <w:p>
+      <w:pPr>
+        <w:shd w:fill="3949AB" w:val="clear"/>
+        <w:spacing w:after="0" w:before="320"/>
+        <w:ind w:left="200" w:right="200"/>
+      </w:pPr>
+      <w:r>
+        <w:rPr>
+          <w:rFonts w:ascii="Arial" w:cs="Arial" w:eastAsia="Arial" w:hAnsi="Arial"/>
+          <w:b/>
+          <w:bCs/>
+          <w:color w:val="FFFFFF"/>
+          <w:sz w:val="26"/>
+          <w:szCs w:val="26"/>
+        </w:rPr>
+        <w:t xml:space="preserve">Parte B — Reto: optimiza de verdad y aplica las 6 R a un caso ajeno</w:t>
+      </w:r>
+    </w:p>
+    <w:p>
+      <w:pPr>
+        <w:spacing w:after="120"/>
+      </w:pPr>
     </w:p>
     <w:p>
       <w:pPr>
@@ -1158,7 +856,21 @@
           <w:sz w:val="24"/>
           <w:szCs w:val="24"/>
         </w:rPr>
-        <w:t xml:space="preserve">Baja el coste sin perder disponibilidad (900 € → 400 €/mes)</w:t>
+        <w:t xml:space="preserve">Encuentra y elimina un coste que ya no debería existir</w:t>
+      </w:r>
+    </w:p>
+    <w:p>
+      <w:pPr>
+        <w:spacing w:after="100"/>
+      </w:pPr>
+      <w:r>
+        <w:rPr>
+          <w:rFonts w:ascii="Arial" w:cs="Arial" w:eastAsia="Arial" w:hAnsi="Arial"/>
+          <w:color w:val="212121"/>
+          <w:sz w:val="22"/>
+          <w:szCs w:val="22"/>
+        </w:rPr>
+        <w:t xml:space="preserve">Si tu EFS de antes de la migración a S3 (Actividad 5.2) seguía existiendo: coste que te ha estado costando sin usarse, y confirmación de que lo has borrado. Si ya no existía: explica por qué borrarlo fue la decisión correcta.</w:t>
       </w:r>
     </w:p>
     <w:tbl>
@@ -1177,73 +889,97 @@
         <w:gridCol w:w="9638"/>
       </w:tblGrid>
       <w:tr>
-        <w:tc>
-          <w:tcPr>
-            <w:tcW w:type="dxa" w:w="9638"/>
-            <w:tcBorders>
-              <w:top w:val="none" w:color="FFFFFF" w:sz="0"/>
-              <w:left w:val="none" w:color="FFFFFF" w:sz="0"/>
-              <w:bottom w:val="none" w:color="FFFFFF" w:sz="0"/>
-              <w:right w:val="none" w:color="FFFFFF" w:sz="0"/>
-            </w:tcBorders>
-            <w:shd w:fill="3949AB" w:val="clear"/>
-            <w:tcMar>
-              <w:top w:type="dxa" w:w="80"/>
-              <w:left w:type="dxa" w:w="160"/>
-              <w:bottom w:type="dxa" w:w="80"/>
-              <w:right w:type="dxa" w:w="160"/>
-            </w:tcMar>
-          </w:tcPr>
-          <w:p>
-            <w:r>
-              <w:rPr>
-                <w:rFonts w:ascii="Arial" w:cs="Arial" w:eastAsia="Arial" w:hAnsi="Arial"/>
-                <w:b/>
-                <w:bCs/>
-                <w:color w:val="FFFFFF"/>
-                <w:sz w:val="20"/>
-                <w:szCs w:val="20"/>
-              </w:rPr>
-              <w:t xml:space="preserve">📸 Propuesta a 400 €/mes con el desglose que demuestra que mantiene las mismas zonas de disponibilidad y el mismo mecanismo de reposición automática</w:t>
-            </w:r>
-          </w:p>
-        </w:tc>
-      </w:tr>
-      <w:tr>
-        <w:trPr>
-          <w:trHeight w:val="2400"/>
-        </w:trPr>
-        <w:tc>
-          <w:tcPr>
-            <w:tcW w:type="dxa" w:w="9638"/>
-            <w:tcBorders>
-              <w:top w:val="single" w:color="E0E0E0" w:sz="4"/>
-              <w:left w:val="single" w:color="E0E0E0" w:sz="4"/>
-              <w:bottom w:val="single" w:color="E0E0E0" w:sz="4"/>
-              <w:right w:val="single" w:color="E0E0E0" w:sz="4"/>
-            </w:tcBorders>
-            <w:shd w:fill="FAFAFA" w:val="clear"/>
-            <w:tcMar>
-              <w:top w:type="dxa" w:w="80"/>
-              <w:left w:type="dxa" w:w="160"/>
-              <w:bottom w:type="dxa" w:w="80"/>
-              <w:right w:type="dxa" w:w="160"/>
-            </w:tcMar>
-          </w:tcPr>
-          <w:p>
-            <w:pPr>
-              <w:jc w:val="center"/>
-            </w:pPr>
-            <w:r>
-              <w:rPr>
-                <w:rFonts w:ascii="Arial" w:cs="Arial" w:eastAsia="Arial" w:hAnsi="Arial"/>
-                <w:i/>
-                <w:iCs/>
-                <w:color w:val="757575"/>
-                <w:sz w:val="20"/>
-                <w:szCs w:val="20"/>
-              </w:rPr>
-              <w:t xml:space="preserve">[Pega aquí la captura de pantalla]</w:t>
+        <w:trPr>
+          <w:trHeight w:val="480"/>
+        </w:trPr>
+        <w:tc>
+          <w:tcPr>
+            <w:tcW w:type="dxa" w:w="9638"/>
+            <w:tcBorders>
+              <w:top w:val="single" w:color="E0E0E0" w:sz="4"/>
+              <w:left w:val="single" w:color="E0E0E0" w:sz="4"/>
+              <w:bottom w:val="single" w:color="E0E0E0" w:sz="4"/>
+              <w:right w:val="single" w:color="E0E0E0" w:sz="4"/>
+            </w:tcBorders>
+            <w:shd w:fill="FAFAFA" w:val="clear"/>
+            <w:tcMar>
+              <w:top w:type="dxa" w:w="60"/>
+              <w:left w:type="dxa" w:w="160"/>
+              <w:bottom w:type="dxa" w:w="60"/>
+              <w:right w:type="dxa" w:w="160"/>
+            </w:tcMar>
+          </w:tcPr>
+          <w:p>
+            <w:r>
+              <w:rPr>
+                <w:sz w:val="22"/>
+                <w:szCs w:val="22"/>
+              </w:rPr>
+              <w:t xml:space="preserve"/>
+            </w:r>
+          </w:p>
+        </w:tc>
+      </w:tr>
+      <w:tr>
+        <w:trPr>
+          <w:trHeight w:val="480"/>
+        </w:trPr>
+        <w:tc>
+          <w:tcPr>
+            <w:tcW w:type="dxa" w:w="9638"/>
+            <w:tcBorders>
+              <w:top w:val="single" w:color="E0E0E0" w:sz="4"/>
+              <w:left w:val="single" w:color="E0E0E0" w:sz="4"/>
+              <w:bottom w:val="single" w:color="E0E0E0" w:sz="4"/>
+              <w:right w:val="single" w:color="E0E0E0" w:sz="4"/>
+            </w:tcBorders>
+            <w:shd w:fill="FAFAFA" w:val="clear"/>
+            <w:tcMar>
+              <w:top w:type="dxa" w:w="60"/>
+              <w:left w:type="dxa" w:w="160"/>
+              <w:bottom w:type="dxa" w:w="60"/>
+              <w:right w:type="dxa" w:w="160"/>
+            </w:tcMar>
+          </w:tcPr>
+          <w:p>
+            <w:r>
+              <w:rPr>
+                <w:sz w:val="22"/>
+                <w:szCs w:val="22"/>
+              </w:rPr>
+              <w:t xml:space="preserve"/>
+            </w:r>
+          </w:p>
+        </w:tc>
+      </w:tr>
+      <w:tr>
+        <w:trPr>
+          <w:trHeight w:val="480"/>
+        </w:trPr>
+        <w:tc>
+          <w:tcPr>
+            <w:tcW w:type="dxa" w:w="9638"/>
+            <w:tcBorders>
+              <w:top w:val="single" w:color="E0E0E0" w:sz="4"/>
+              <w:left w:val="single" w:color="E0E0E0" w:sz="4"/>
+              <w:bottom w:val="single" w:color="E0E0E0" w:sz="4"/>
+              <w:right w:val="single" w:color="E0E0E0" w:sz="4"/>
+            </w:tcBorders>
+            <w:shd w:fill="FAFAFA" w:val="clear"/>
+            <w:tcMar>
+              <w:top w:type="dxa" w:w="60"/>
+              <w:left w:type="dxa" w:w="160"/>
+              <w:bottom w:type="dxa" w:w="60"/>
+              <w:right w:type="dxa" w:w="160"/>
+            </w:tcMar>
+          </w:tcPr>
+          <w:p>
+            <w:r>
+              <w:rPr>
+                <w:sz w:val="22"/>
+                <w:szCs w:val="22"/>
+              </w:rPr>
+              <w:t xml:space="preserve"/>
             </w:r>
           </w:p>
         </w:tc>
@@ -1251,41 +987,8 @@
     </w:tbl>
     <w:p>
       <w:pPr>
-        <w:spacing w:after="160"/>
-      </w:pPr>
-    </w:p>
-    <w:p>
-      <w:pPr>
-        <w:pBdr>
-          <w:bottom w:val="single" w:color="FFA000" w:sz="4" w:space="1"/>
-        </w:pBdr>
-        <w:spacing w:after="120" w:before="240"/>
-      </w:pPr>
-      <w:r>
-        <w:rPr>
-          <w:rFonts w:ascii="Arial" w:cs="Arial" w:eastAsia="Arial" w:hAnsi="Arial"/>
-          <w:b/>
-          <w:bCs/>
-          <w:color w:val="3949AB"/>
-          <w:sz w:val="24"/>
-          <w:szCs w:val="24"/>
-        </w:rPr>
-        <w:t xml:space="preserve">Decide una migración con las 6 R</w:t>
-      </w:r>
-    </w:p>
-    <w:p>
-      <w:pPr>
-        <w:spacing w:after="100"/>
-      </w:pPr>
-      <w:r>
-        <w:rPr>
-          <w:rFonts w:ascii="Arial" w:cs="Arial" w:eastAsia="Arial" w:hAnsi="Arial"/>
-          <w:color w:val="212121"/>
-          <w:sz w:val="22"/>
-          <w:szCs w:val="22"/>
-        </w:rPr>
-        <w:t xml:space="preserve">Caso entregado por el profesor, estrategia elegida y justificación con criterios de negocio.</w:t>
-      </w:r>
+        <w:spacing w:after="120"/>
+      </w:pPr>
     </w:p>
     <w:tbl>
       <w:tblPr>
@@ -1303,6 +1006,156 @@
         <w:gridCol w:w="9638"/>
       </w:tblGrid>
       <w:tr>
+        <w:tc>
+          <w:tcPr>
+            <w:tcW w:type="dxa" w:w="9638"/>
+            <w:tcBorders>
+              <w:top w:val="none" w:color="FFFFFF" w:sz="0"/>
+              <w:left w:val="none" w:color="FFFFFF" w:sz="0"/>
+              <w:bottom w:val="none" w:color="FFFFFF" w:sz="0"/>
+              <w:right w:val="none" w:color="FFFFFF" w:sz="0"/>
+            </w:tcBorders>
+            <w:shd w:fill="3949AB" w:val="clear"/>
+            <w:tcMar>
+              <w:top w:type="dxa" w:w="80"/>
+              <w:left w:type="dxa" w:w="160"/>
+              <w:bottom w:type="dxa" w:w="80"/>
+              <w:right w:type="dxa" w:w="160"/>
+            </w:tcMar>
+          </w:tcPr>
+          <w:p>
+            <w:r>
+              <w:rPr>
+                <w:rFonts w:ascii="Arial" w:cs="Arial" w:eastAsia="Arial" w:hAnsi="Arial"/>
+                <w:b/>
+                <w:bCs/>
+                <w:color w:val="FFFFFF"/>
+                <w:sz w:val="20"/>
+                <w:szCs w:val="20"/>
+              </w:rPr>
+              <w:t xml:space="preserve">📸 La consola de EFS mostrando que el sistema de ficheros ya no existe, y tu coste mensual recalculado sin esa partida</w:t>
+            </w:r>
+          </w:p>
+        </w:tc>
+      </w:tr>
+      <w:tr>
+        <w:trPr>
+          <w:trHeight w:val="2400"/>
+        </w:trPr>
+        <w:tc>
+          <w:tcPr>
+            <w:tcW w:type="dxa" w:w="9638"/>
+            <w:tcBorders>
+              <w:top w:val="single" w:color="E0E0E0" w:sz="4"/>
+              <w:left w:val="single" w:color="E0E0E0" w:sz="4"/>
+              <w:bottom w:val="single" w:color="E0E0E0" w:sz="4"/>
+              <w:right w:val="single" w:color="E0E0E0" w:sz="4"/>
+            </w:tcBorders>
+            <w:shd w:fill="FAFAFA" w:val="clear"/>
+            <w:tcMar>
+              <w:top w:type="dxa" w:w="80"/>
+              <w:left w:type="dxa" w:w="160"/>
+              <w:bottom w:type="dxa" w:w="80"/>
+              <w:right w:type="dxa" w:w="160"/>
+            </w:tcMar>
+          </w:tcPr>
+          <w:p>
+            <w:pPr>
+              <w:jc w:val="center"/>
+            </w:pPr>
+            <w:r>
+              <w:rPr>
+                <w:rFonts w:ascii="Arial" w:cs="Arial" w:eastAsia="Arial" w:hAnsi="Arial"/>
+                <w:i/>
+                <w:iCs/>
+                <w:color w:val="757575"/>
+                <w:sz w:val="20"/>
+                <w:szCs w:val="20"/>
+              </w:rPr>
+              <w:t xml:space="preserve">[Pega aquí la captura de pantalla]</w:t>
+            </w:r>
+          </w:p>
+        </w:tc>
+      </w:tr>
+    </w:tbl>
+    <w:p>
+      <w:pPr>
+        <w:spacing w:after="160"/>
+      </w:pPr>
+    </w:p>
+    <w:p>
+      <w:r>
+        <w:br w:type="page"/>
+      </w:r>
+    </w:p>
+    <w:p>
+      <w:pPr>
+        <w:pBdr>
+          <w:bottom w:val="single" w:color="FFA000" w:sz="4" w:space="1"/>
+        </w:pBdr>
+        <w:spacing w:after="120" w:before="240"/>
+      </w:pPr>
+      <w:r>
+        <w:rPr>
+          <w:rFonts w:ascii="Arial" w:cs="Arial" w:eastAsia="Arial" w:hAnsi="Arial"/>
+          <w:b/>
+          <w:bCs/>
+          <w:color w:val="3949AB"/>
+          <w:sz w:val="24"/>
+          <w:szCs w:val="24"/>
+        </w:rPr>
+        <w:t xml:space="preserve">Aplica las 6 R a un caso que no es el tuyo</w:t>
+      </w:r>
+    </w:p>
+    <w:p>
+      <w:pPr>
+        <w:spacing w:after="100"/>
+      </w:pPr>
+      <w:r>
+        <w:rPr>
+          <w:rFonts w:ascii="Arial" w:cs="Arial" w:eastAsia="Arial" w:hAnsi="Arial"/>
+          <w:color w:val="212121"/>
+          <w:sz w:val="22"/>
+          <w:szCs w:val="22"/>
+        </w:rPr>
+        <w:t xml:space="preserve">El caso: una tienda de barrio con su aplicación de inventario en un único ordenador de la trastienda, sin copias de seguridad, con dos averías este año, y sin presupuesto ni tiempo para rehacerla desde cero.</w:t>
+      </w:r>
+    </w:p>
+    <w:p>
+      <w:pPr>
+        <w:spacing w:after="80"/>
+      </w:pPr>
+    </w:p>
+    <w:p>
+      <w:pPr>
+        <w:spacing w:after="100"/>
+      </w:pPr>
+      <w:r>
+        <w:rPr>
+          <w:rFonts w:ascii="Arial" w:cs="Arial" w:eastAsia="Arial" w:hAnsi="Arial"/>
+          <w:color w:val="212121"/>
+          <w:sz w:val="22"/>
+          <w:szCs w:val="22"/>
+        </w:rPr>
+        <w:t xml:space="preserve">1. Qué estrategia de las 6 R eliges y por qué encaja mejor que las otras cinco en este caso concreto:</w:t>
+      </w:r>
+    </w:p>
+    <w:tbl>
+      <w:tblPr>
+        <w:tblW w:type="dxa" w:w="9638"/>
+        <w:tblBorders>
+          <w:top w:val="single" w:color="auto" w:sz="4"/>
+          <w:left w:val="single" w:color="auto" w:sz="4"/>
+          <w:bottom w:val="single" w:color="auto" w:sz="4"/>
+          <w:right w:val="single" w:color="auto" w:sz="4"/>
+          <w:insideH w:val="single" w:color="auto" w:sz="4"/>
+          <w:insideV w:val="single" w:color="auto" w:sz="4"/>
+        </w:tblBorders>
+      </w:tblPr>
+      <w:tblGrid>
+        <w:gridCol w:w="9638"/>
+      </w:tblGrid>
+      <w:tr>
         <w:trPr>
           <w:trHeight w:val="480"/>
         </w:trPr>
@@ -1366,6 +1219,204 @@
           </w:p>
         </w:tc>
       </w:tr>
+      <w:tr>
+        <w:trPr>
+          <w:trHeight w:val="480"/>
+        </w:trPr>
+        <w:tc>
+          <w:tcPr>
+            <w:tcW w:type="dxa" w:w="9638"/>
+            <w:tcBorders>
+              <w:top w:val="single" w:color="E0E0E0" w:sz="4"/>
+              <w:left w:val="single" w:color="E0E0E0" w:sz="4"/>
+              <w:bottom w:val="single" w:color="E0E0E0" w:sz="4"/>
+              <w:right w:val="single" w:color="E0E0E0" w:sz="4"/>
+            </w:tcBorders>
+            <w:shd w:fill="FAFAFA" w:val="clear"/>
+            <w:tcMar>
+              <w:top w:type="dxa" w:w="60"/>
+              <w:left w:type="dxa" w:w="160"/>
+              <w:bottom w:type="dxa" w:w="60"/>
+              <w:right w:type="dxa" w:w="160"/>
+            </w:tcMar>
+          </w:tcPr>
+          <w:p>
+            <w:r>
+              <w:rPr>
+                <w:sz w:val="22"/>
+                <w:szCs w:val="22"/>
+              </w:rPr>
+              <w:t xml:space="preserve"/>
+            </w:r>
+          </w:p>
+        </w:tc>
+      </w:tr>
+    </w:tbl>
+    <w:p>
+      <w:pPr>
+        <w:spacing w:after="120"/>
+      </w:pPr>
+    </w:p>
+    <w:p>
+      <w:pPr>
+        <w:spacing w:after="100"/>
+      </w:pPr>
+      <w:r>
+        <w:rPr>
+          <w:rFonts w:ascii="Arial" w:cs="Arial" w:eastAsia="Arial" w:hAnsi="Arial"/>
+          <w:color w:val="212121"/>
+          <w:sz w:val="22"/>
+          <w:szCs w:val="22"/>
+        </w:rPr>
+        <w:t xml:space="preserve">2. Qué cambia técnicamente con tu elección (qué se mueve, qué se queda igual):</w:t>
+      </w:r>
+    </w:p>
+    <w:tbl>
+      <w:tblPr>
+        <w:tblW w:type="dxa" w:w="9638"/>
+        <w:tblBorders>
+          <w:top w:val="single" w:color="auto" w:sz="4"/>
+          <w:left w:val="single" w:color="auto" w:sz="4"/>
+          <w:bottom w:val="single" w:color="auto" w:sz="4"/>
+          <w:right w:val="single" w:color="auto" w:sz="4"/>
+          <w:insideH w:val="single" w:color="auto" w:sz="4"/>
+          <w:insideV w:val="single" w:color="auto" w:sz="4"/>
+        </w:tblBorders>
+      </w:tblPr>
+      <w:tblGrid>
+        <w:gridCol w:w="9638"/>
+      </w:tblGrid>
+      <w:tr>
+        <w:trPr>
+          <w:trHeight w:val="480"/>
+        </w:trPr>
+        <w:tc>
+          <w:tcPr>
+            <w:tcW w:type="dxa" w:w="9638"/>
+            <w:tcBorders>
+              <w:top w:val="single" w:color="E0E0E0" w:sz="4"/>
+              <w:left w:val="single" w:color="E0E0E0" w:sz="4"/>
+              <w:bottom w:val="single" w:color="E0E0E0" w:sz="4"/>
+              <w:right w:val="single" w:color="E0E0E0" w:sz="4"/>
+            </w:tcBorders>
+            <w:shd w:fill="FAFAFA" w:val="clear"/>
+            <w:tcMar>
+              <w:top w:type="dxa" w:w="60"/>
+              <w:left w:type="dxa" w:w="160"/>
+              <w:bottom w:type="dxa" w:w="60"/>
+              <w:right w:type="dxa" w:w="160"/>
+            </w:tcMar>
+          </w:tcPr>
+          <w:p>
+            <w:r>
+              <w:rPr>
+                <w:sz w:val="22"/>
+                <w:szCs w:val="22"/>
+              </w:rPr>
+              <w:t xml:space="preserve"/>
+            </w:r>
+          </w:p>
+        </w:tc>
+      </w:tr>
+      <w:tr>
+        <w:trPr>
+          <w:trHeight w:val="480"/>
+        </w:trPr>
+        <w:tc>
+          <w:tcPr>
+            <w:tcW w:type="dxa" w:w="9638"/>
+            <w:tcBorders>
+              <w:top w:val="single" w:color="E0E0E0" w:sz="4"/>
+              <w:left w:val="single" w:color="E0E0E0" w:sz="4"/>
+              <w:bottom w:val="single" w:color="E0E0E0" w:sz="4"/>
+              <w:right w:val="single" w:color="E0E0E0" w:sz="4"/>
+            </w:tcBorders>
+            <w:shd w:fill="FAFAFA" w:val="clear"/>
+            <w:tcMar>
+              <w:top w:type="dxa" w:w="60"/>
+              <w:left w:type="dxa" w:w="160"/>
+              <w:bottom w:type="dxa" w:w="60"/>
+              <w:right w:type="dxa" w:w="160"/>
+            </w:tcMar>
+          </w:tcPr>
+          <w:p>
+            <w:r>
+              <w:rPr>
+                <w:sz w:val="22"/>
+                <w:szCs w:val="22"/>
+              </w:rPr>
+              <w:t xml:space="preserve"/>
+            </w:r>
+          </w:p>
+        </w:tc>
+      </w:tr>
+      <w:tr>
+        <w:trPr>
+          <w:trHeight w:val="480"/>
+        </w:trPr>
+        <w:tc>
+          <w:tcPr>
+            <w:tcW w:type="dxa" w:w="9638"/>
+            <w:tcBorders>
+              <w:top w:val="single" w:color="E0E0E0" w:sz="4"/>
+              <w:left w:val="single" w:color="E0E0E0" w:sz="4"/>
+              <w:bottom w:val="single" w:color="E0E0E0" w:sz="4"/>
+              <w:right w:val="single" w:color="E0E0E0" w:sz="4"/>
+            </w:tcBorders>
+            <w:shd w:fill="FAFAFA" w:val="clear"/>
+            <w:tcMar>
+              <w:top w:type="dxa" w:w="60"/>
+              <w:left w:type="dxa" w:w="160"/>
+              <w:bottom w:type="dxa" w:w="60"/>
+              <w:right w:type="dxa" w:w="160"/>
+            </w:tcMar>
+          </w:tcPr>
+          <w:p>
+            <w:r>
+              <w:rPr>
+                <w:sz w:val="22"/>
+                <w:szCs w:val="22"/>
+              </w:rPr>
+              <w:t xml:space="preserve"/>
+            </w:r>
+          </w:p>
+        </w:tc>
+      </w:tr>
+    </w:tbl>
+    <w:p>
+      <w:pPr>
+        <w:spacing w:after="120"/>
+      </w:pPr>
+    </w:p>
+    <w:p>
+      <w:pPr>
+        <w:spacing w:after="100"/>
+      </w:pPr>
+      <w:r>
+        <w:rPr>
+          <w:rFonts w:ascii="Arial" w:cs="Arial" w:eastAsia="Arial" w:hAnsi="Arial"/>
+          <w:color w:val="212121"/>
+          <w:sz w:val="22"/>
+          <w:szCs w:val="22"/>
+        </w:rPr>
+        <w:t xml:space="preserve">3. Qué problema de los que tiene ahora mismo queda resuelto, y cuál no queda resuelto todavía con solo esa estrategia:</w:t>
+      </w:r>
+    </w:p>
+    <w:tbl>
+      <w:tblPr>
+        <w:tblW w:type="dxa" w:w="9638"/>
+        <w:tblBorders>
+          <w:top w:val="single" w:color="auto" w:sz="4"/>
+          <w:left w:val="single" w:color="auto" w:sz="4"/>
+          <w:bottom w:val="single" w:color="auto" w:sz="4"/>
+          <w:right w:val="single" w:color="auto" w:sz="4"/>
+          <w:insideH w:val="single" w:color="auto" w:sz="4"/>
+          <w:insideV w:val="single" w:color="auto" w:sz="4"/>
+        </w:tblBorders>
+      </w:tblPr>
+      <w:tblGrid>
+        <w:gridCol w:w="9638"/>
+      </w:tblGrid>
       <w:tr>
         <w:trPr>
           <w:trHeight w:val="480"/>

</xml_diff>